<commit_message>
Spec: 7.3 il guscio che cambia, 13.5 le sette cancellature
Il documento recepisce l'uovo che si incrina giorno per giorno, col vincolo
che lo governa: dentro cresce una massa, mai una sagoma.

E soprattutto registra le CANCELLATURE, che e' il motivo per cui la sezione
esiste: una cosa tolta e' la decisione piu' facile da annullare per sbaglio,
perche' basta che qualcuno la rimetta «perche' mancava».

Piu' quattro invarianti e due righe di indice di migrazione.

Co-Authored-By: Claude Opus 5 <noreply@anthropic.com>
Claude-Session: https://claude.ai/code/session_01MZ3Kcg8KwrJZAwo8rU3dAm
</commit_message>
<xml_diff>
--- a/VINZ_MON_MASTER_SPEC_v1.10.docx
+++ b/VINZ_MON_MASTER_SPEC_v1.10.docx
@@ -824,6 +824,94 @@
           </w:p>
         </w:tc>
       </w:tr>
+      <w:tr>
+        <w:tc>
+          <w:tcPr>
+            <w:tcW w:type="dxa" w:w="3120"/>
+          </w:tcPr>
+          <w:p>
+            <w:r>
+              <w:rPr>
+                <w:sz w:val="19"/>
+                <w:szCs w:val="19"/>
+              </w:rPr>
+              <w:t xml:space="preserve">§7.3 🔷</w:t>
+            </w:r>
+          </w:p>
+        </w:tc>
+        <w:tc>
+          <w:tcPr>
+            <w:tcW w:type="dxa" w:w="3120"/>
+          </w:tcPr>
+          <w:p>
+            <w:r>
+              <w:rPr>
+                <w:sz w:val="19"/>
+                <w:szCs w:val="19"/>
+              </w:rPr>
+              <w:t xml:space="preserve">Il guscio cambia ogni giorno</w:t>
+            </w:r>
+          </w:p>
+        </w:tc>
+        <w:tc>
+          <w:tcPr>
+            <w:tcW w:type="dxa" w:w="3120"/>
+          </w:tcPr>
+          <w:p>
+            <w:r>
+              <w:rPr>
+                <w:sz w:val="19"/>
+                <w:szCs w:val="19"/>
+              </w:rPr>
+              <w:t xml:space="preserve">un numero non si sente addosso, una crepa sì</w:t>
+            </w:r>
+          </w:p>
+        </w:tc>
+      </w:tr>
+      <w:tr>
+        <w:tc>
+          <w:tcPr>
+            <w:tcW w:type="dxa" w:w="3120"/>
+          </w:tcPr>
+          <w:p>
+            <w:r>
+              <w:rPr>
+                <w:sz w:val="19"/>
+                <w:szCs w:val="19"/>
+              </w:rPr>
+              <w:t xml:space="preserve">§13.5 🔷</w:t>
+            </w:r>
+          </w:p>
+        </w:tc>
+        <w:tc>
+          <w:tcPr>
+            <w:tcW w:type="dxa" w:w="3120"/>
+          </w:tcPr>
+          <w:p>
+            <w:r>
+              <w:rPr>
+                <w:sz w:val="19"/>
+                <w:szCs w:val="19"/>
+              </w:rPr>
+              <w:t xml:space="preserve">Sette cancellature nell'interfaccia</w:t>
+            </w:r>
+          </w:p>
+        </w:tc>
+        <w:tc>
+          <w:tcPr>
+            <w:tcW w:type="dxa" w:w="3120"/>
+          </w:tcPr>
+          <w:p>
+            <w:r>
+              <w:rPr>
+                <w:sz w:val="19"/>
+                <w:szCs w:val="19"/>
+              </w:rPr>
+              <w:t xml:space="preserve">telemetria del motore e annunci doppi su superfici di prodotto</w:t>
+            </w:r>
+          </w:p>
+        </w:tc>
+      </w:tr>
     </w:tbl>
     <w:p>
       <w:pPr>
@@ -2047,6 +2135,545 @@
       </w:r>
       <w:r>
         <w:t xml:space="preserve">Quello che gli racconti prima che nasca entra nella memoria e alimenta la voce che avrà dopo. I suoni spariscono con l'HATCH; il contenuto resta.</w:t>
+      </w:r>
+    </w:p>
+    <w:p>
+      <w:pPr>
+        <w:pStyle w:val="Heading1"/>
+        <w:spacing w:after="160" w:before="360"/>
+      </w:pPr>
+      <w:r>
+        <w:t xml:space="preserve">7.3 · IL GUSCIO CAMBIA OGNI GIORNO 🔷</w:t>
+      </w:r>
+    </w:p>
+    <w:p>
+      <w:pPr>
+        <w:spacing w:after="120"/>
+      </w:pPr>
+      <w:r>
+        <w:t xml:space="preserve">L'incubazione chiedeva sette giorni di racconto e restituiva un numero e una barra a segmenti. Un numero non si sente addosso. Un guscio che si incrina davanti a te sì.</w:t>
+      </w:r>
+    </w:p>
+    <w:p>
+      <w:pPr>
+        <w:spacing w:after="100"/>
+        <w:ind w:left="220"/>
+      </w:pPr>
+      <w:r>
+        <w:rPr>
+          <w:b/>
+          <w:bCs/>
+        </w:rPr>
+        <w:t xml:space="preserve">🔒  </w:t>
+      </w:r>
+      <w:r>
+        <w:t xml:space="preserve">Ogni giorno chiuso lascia una CREPA NUOVA sul guscio, in posizione fissa e deterministica. È lo stesso valore che riempiva la barra a segmenti, disegnato invece che contato — e infatti la barra è stata tolta.</w:t>
+      </w:r>
+    </w:p>
+    <w:p>
+      <w:pPr>
+        <w:spacing w:after="100"/>
+        <w:ind w:left="220"/>
+      </w:pPr>
+      <w:r>
+        <w:rPr>
+          <w:b/>
+          <w:bCs/>
+        </w:rPr>
+        <w:t xml:space="preserve">🔒  </w:t>
+      </w:r>
+      <w:r>
+        <w:t xml:space="preserve">La MASSA dentro guadagna presenza a ogni giorno: alone al primo, densa al settimo.</w:t>
+      </w:r>
+    </w:p>
+    <w:p>
+      <w:pPr>
+        <w:spacing w:after="100"/>
+        <w:ind w:left="220"/>
+      </w:pPr>
+      <w:r>
+        <w:rPr>
+          <w:b/>
+          <w:bCs/>
+        </w:rPr>
+        <w:t xml:space="preserve">🔒  </w:t>
+      </w:r>
+      <w:r>
+        <w:t xml:space="preserve">Il RESPIRO accorcia il periodo man mano — lento e sordo all'inizio, corto e presente alla fine. È l'unica cosa che dice «è vivo» senza mostrare cosa.</w:t>
+      </w:r>
+    </w:p>
+    <w:p>
+      <w:pPr>
+        <w:spacing w:after="100"/>
+        <w:ind w:left="220"/>
+      </w:pPr>
+      <w:r>
+        <w:rPr>
+          <w:b/>
+          <w:bCs/>
+        </w:rPr>
+        <w:t xml:space="preserve">🔒  </w:t>
+      </w:r>
+      <w:r>
+        <w:t xml:space="preserve">Quando arriva una crepa, il guscio ha un SUSSULTO. Una volta sola, non un ciclo: chiudere la giornata deve vedersi nel momento in cui succede.</w:t>
+      </w:r>
+    </w:p>
+    <w:p>
+      <w:pPr>
+        <w:spacing w:after="100"/>
+        <w:ind w:left="220"/>
+      </w:pPr>
+      <w:r>
+        <w:rPr>
+          <w:b/>
+          <w:bCs/>
+        </w:rPr>
+        <w:t xml:space="preserve">🔒  </w:t>
+      </w:r>
+      <w:r>
+        <w:t xml:space="preserve">A sette giorni il guscio si apre a tratteggio e le crepe prendono un alone. Non lampeggia: lampeggiare è un allarme, e questo non è un allarme.</w:t>
+      </w:r>
+    </w:p>
+    <w:p>
+      <w:pPr>
+        <w:pStyle w:val="Heading2"/>
+        <w:spacing w:after="120" w:before="260"/>
+      </w:pPr>
+      <w:r>
+        <w:t xml:space="preserve">Il vincolo che comanda tutto il disegno</w:t>
+      </w:r>
+    </w:p>
+    <w:p>
+      <w:pPr>
+        <w:spacing w:after="100"/>
+        <w:ind w:left="220"/>
+      </w:pPr>
+      <w:r>
+        <w:rPr>
+          <w:b/>
+          <w:bCs/>
+        </w:rPr>
+        <w:t xml:space="preserve">🔒  </w:t>
+      </w:r>
+      <w:r>
+        <w:t xml:space="preserve">Quello che cresce dentro è una MASSA e non deve MAI leggersi come una figura. §12/01 vieta di anticipare la forma futura: niente profilo, niente occhi, niente ali che si intravedono. Se qualcuno guardando il guscio riconosce una creatura, il componente è rotto.</w:t>
+      </w:r>
+    </w:p>
+    <w:p>
+      <w:pPr>
+        <w:spacing w:after="100"/>
+        <w:ind w:left="220"/>
+      </w:pPr>
+      <w:r>
+        <w:rPr>
+          <w:b/>
+          <w:bCs/>
+        </w:rPr>
+        <w:t xml:space="preserve">🔒  </w:t>
+      </w:r>
+      <w:r>
+        <w:t xml:space="preserve">Tutto è disegnato dal codice. Nessun asset, nessuna arte inventata (§18A).</w:t>
+      </w:r>
+    </w:p>
+    <w:p>
+      <w:pPr>
+        <w:pStyle w:val="Heading1"/>
+        <w:spacing w:after="160" w:before="360"/>
+      </w:pPr>
+      <w:r>
+        <w:t xml:space="preserve">13.5 · SETTE CANCELLATURE 🔷</w:t>
+      </w:r>
+    </w:p>
+    <w:p>
+      <w:pPr>
+        <w:spacing w:after="120"/>
+      </w:pPr>
+      <w:r>
+        <w:t xml:space="preserve">Nessuna di queste è una funzione nuova: sono cose tolte. Stanno nel documento perché una cancellatura è la decisione più facile da annullare per sbaglio — basta che qualcuno rimetta l'elemento «perché mancava».</w:t>
+      </w:r>
+    </w:p>
+    <w:p>
+      <w:pPr>
+        <w:spacing w:after="120"/>
+      </w:pPr>
+    </w:p>
+    <w:tbl>
+      <w:tblPr>
+        <w:tblW w:type="dxa" w:w="9360"/>
+        <w:tblBorders>
+          <w:top w:val="single" w:color="auto" w:sz="4"/>
+          <w:left w:val="single" w:color="auto" w:sz="4"/>
+          <w:bottom w:val="single" w:color="auto" w:sz="4"/>
+          <w:right w:val="single" w:color="auto" w:sz="4"/>
+          <w:insideH w:val="single" w:color="auto" w:sz="4"/>
+          <w:insideV w:val="single" w:color="auto" w:sz="4"/>
+        </w:tblBorders>
+      </w:tblPr>
+      <w:tblGrid>
+        <w:gridCol w:w="4680"/>
+        <w:gridCol w:w="4680"/>
+      </w:tblGrid>
+      <w:tr>
+        <w:trPr>
+          <w:tblHeader/>
+        </w:trPr>
+        <w:tc>
+          <w:tcPr>
+            <w:tcW w:type="dxa" w:w="4680"/>
+            <w:shd w:fill="EEEEEE" w:val="clear"/>
+          </w:tcPr>
+          <w:p>
+            <w:r>
+              <w:rPr>
+                <w:b/>
+                <w:bCs/>
+                <w:sz w:val="19"/>
+                <w:szCs w:val="19"/>
+              </w:rPr>
+              <w:t xml:space="preserve">COSA È STATO TOLTO</w:t>
+            </w:r>
+          </w:p>
+        </w:tc>
+        <w:tc>
+          <w:tcPr>
+            <w:tcW w:type="dxa" w:w="4680"/>
+            <w:shd w:fill="EEEEEE" w:val="clear"/>
+          </w:tcPr>
+          <w:p>
+            <w:r>
+              <w:rPr>
+                <w:b/>
+                <w:bCs/>
+                <w:sz w:val="19"/>
+                <w:szCs w:val="19"/>
+              </w:rPr>
+              <w:t xml:space="preserve">PERCHÉ</w:t>
+            </w:r>
+          </w:p>
+        </w:tc>
+      </w:tr>
+      <w:tr>
+        <w:tc>
+          <w:tcPr>
+            <w:tcW w:type="dxa" w:w="4680"/>
+          </w:tcPr>
+          <w:p>
+            <w:r>
+              <w:rPr>
+                <w:sz w:val="19"/>
+                <w:szCs w:val="19"/>
+              </w:rPr>
+              <w:t xml:space="preserve">SEED e CONFIG dal profilo</w:t>
+            </w:r>
+          </w:p>
+        </w:tc>
+        <w:tc>
+          <w:tcPr>
+            <w:tcW w:type="dxa" w:w="4680"/>
+          </w:tcPr>
+          <w:p>
+            <w:r>
+              <w:rPr>
+                <w:sz w:val="19"/>
+                <w:szCs w:val="19"/>
+              </w:rPr>
+              <w:t xml:space="preserve">§29 confina la traccia di generazione in DEV, e il seed era su una superficie di prodotto</w:t>
+            </w:r>
+          </w:p>
+        </w:tc>
+      </w:tr>
+      <w:tr>
+        <w:tc>
+          <w:tcPr>
+            <w:tcW w:type="dxa" w:w="4680"/>
+          </w:tcPr>
+          <w:p>
+            <w:r>
+              <w:rPr>
+                <w:sz w:val="19"/>
+                <w:szCs w:val="19"/>
+              </w:rPr>
+              <w:t xml:space="preserve">RARITY SCORE, STADIO, DATA CONFIDENCE dal profilo</w:t>
+            </w:r>
+          </w:p>
+        </w:tc>
+        <w:tc>
+          <w:tcPr>
+            <w:tcW w:type="dxa" w:w="4680"/>
+          </w:tcPr>
+          <w:p>
+            <w:r>
+              <w:rPr>
+                <w:sz w:val="19"/>
+                <w:szCs w:val="19"/>
+              </w:rPr>
+              <w:t xml:space="preserve">dicevano come il .mon era stato calcolato, non cosa fosse</w:t>
+            </w:r>
+          </w:p>
+        </w:tc>
+      </w:tr>
+      <w:tr>
+        <w:tc>
+          <w:tcPr>
+            <w:tcW w:type="dxa" w:w="4680"/>
+          </w:tcPr>
+          <w:p>
+            <w:r>
+              <w:rPr>
+                <w:sz w:val="19"/>
+                <w:szCs w:val="19"/>
+              </w:rPr>
+              <w:t xml:space="preserve">DATA CONFIDENCE dal daily scan</w:t>
+            </w:r>
+          </w:p>
+        </w:tc>
+        <w:tc>
+          <w:tcPr>
+            <w:tcW w:type="dxa" w:w="4680"/>
+          </w:tcPr>
+          <w:p>
+            <w:r>
+              <w:rPr>
+                <w:sz w:val="19"/>
+                <w:szCs w:val="19"/>
+              </w:rPr>
+              <w:t xml:space="preserve">era la TERZA superficie che la mostrava: resta solo l'avviso «pochi dati», che è una promessa di onestà e non una metrica</w:t>
+            </w:r>
+          </w:p>
+        </w:tc>
+      </w:tr>
+      <w:tr>
+        <w:tc>
+          <w:tcPr>
+            <w:tcW w:type="dxa" w:w="4680"/>
+          </w:tcPr>
+          <w:p>
+            <w:r>
+              <w:rPr>
+                <w:sz w:val="19"/>
+                <w:szCs w:val="19"/>
+              </w:rPr>
+              <w:t xml:space="preserve">La sigla NEU / AMU / ALE in chat</w:t>
+            </w:r>
+          </w:p>
+        </w:tc>
+        <w:tc>
+          <w:tcPr>
+            <w:tcW w:type="dxa" w:w="4680"/>
+          </w:tcPr>
+          <w:p>
+            <w:r>
+              <w:rPr>
+                <w:sz w:val="19"/>
+                <w:szCs w:val="19"/>
+              </w:rPr>
+              <w:t xml:space="preserve">era il codice interno dell'espressione: una stringa di debug nel punto più intimo del prodotto</w:t>
+            </w:r>
+          </w:p>
+        </w:tc>
+      </w:tr>
+      <w:tr>
+        <w:tc>
+          <w:tcPr>
+            <w:tcW w:type="dxa" w:w="4680"/>
+          </w:tcPr>
+          <w:p>
+            <w:r>
+              <w:rPr>
+                <w:sz w:val="19"/>
+                <w:szCs w:val="19"/>
+              </w:rPr>
+              <w:t xml:space="preserve">Il banner MINDLINE SHIFT</w:t>
+            </w:r>
+          </w:p>
+        </w:tc>
+        <w:tc>
+          <w:tcPr>
+            <w:tcW w:type="dxa" w:w="4680"/>
+          </w:tcPr>
+          <w:p>
+            <w:r>
+              <w:rPr>
+                <w:sz w:val="19"/>
+                <w:szCs w:val="19"/>
+              </w:rPr>
+              <w:t xml:space="preserve">stava fra la creatura e la conversazione e non si poteva congedare. Ora è la linea di SYNC a diventare l'annuncio quando si riempie</w:t>
+            </w:r>
+          </w:p>
+        </w:tc>
+      </w:tr>
+      <w:tr>
+        <w:tc>
+          <w:tcPr>
+            <w:tcW w:type="dxa" w:w="4680"/>
+          </w:tcPr>
+          <w:p>
+            <w:r>
+              <w:rPr>
+                <w:sz w:val="19"/>
+                <w:szCs w:val="19"/>
+              </w:rPr>
+              <w:t xml:space="preserve">L'annuncio ripetuto nel calendario</w:t>
+            </w:r>
+          </w:p>
+        </w:tc>
+        <w:tc>
+          <w:tcPr>
+            <w:tcW w:type="dxa" w:w="4680"/>
+          </w:tcPr>
+          <w:p>
+            <w:r>
+              <w:rPr>
+                <w:sz w:val="19"/>
+                <w:szCs w:val="19"/>
+              </w:rPr>
+              <w:t xml:space="preserve">la stessa notizia su due schermate con parole diverse: la seconda volta non si capisce se è nuova</w:t>
+            </w:r>
+          </w:p>
+        </w:tc>
+      </w:tr>
+      <w:tr>
+        <w:tc>
+          <w:tcPr>
+            <w:tcW w:type="dxa" w:w="4680"/>
+          </w:tcPr>
+          <w:p>
+            <w:r>
+              <w:rPr>
+                <w:sz w:val="19"/>
+                <w:szCs w:val="19"/>
+              </w:rPr>
+              <w:t xml:space="preserve">Quattro voci su sette dalla legenda del calendario</w:t>
+            </w:r>
+          </w:p>
+        </w:tc>
+        <w:tc>
+          <w:tcPr>
+            <w:tcW w:type="dxa" w:w="4680"/>
+          </w:tcPr>
+          <w:p>
+            <w:r>
+              <w:rPr>
+                <w:sz w:val="19"/>
+                <w:szCs w:val="19"/>
+              </w:rPr>
+              <w:t xml:space="preserve">i traguardi non sono stati del giorno, sono eventi, e si leggono toccando il giorno</w:t>
+            </w:r>
+          </w:p>
+        </w:tc>
+      </w:tr>
+      <w:tr>
+        <w:tc>
+          <w:tcPr>
+            <w:tcW w:type="dxa" w:w="4680"/>
+          </w:tcPr>
+          <w:p>
+            <w:r>
+              <w:rPr>
+                <w:sz w:val="19"/>
+                <w:szCs w:val="19"/>
+              </w:rPr>
+              <w:t xml:space="preserve">ANNULLA in fondo a REGISTRA</w:t>
+            </w:r>
+          </w:p>
+        </w:tc>
+        <w:tc>
+          <w:tcPr>
+            <w:tcW w:type="dxa" w:w="4680"/>
+          </w:tcPr>
+          <w:p>
+            <w:r>
+              <w:rPr>
+                <w:sz w:val="19"/>
+                <w:szCs w:val="19"/>
+              </w:rPr>
+              <w:t xml:space="preserve">due uscite per la stessa porta fanno esitare, e quella in basso rubava spazio all'unica azione che conta</w:t>
+            </w:r>
+          </w:p>
+        </w:tc>
+      </w:tr>
+      <w:tr>
+        <w:tc>
+          <w:tcPr>
+            <w:tcW w:type="dxa" w:w="4680"/>
+          </w:tcPr>
+          <w:p>
+            <w:r>
+              <w:rPr>
+                <w:sz w:val="19"/>
+                <w:szCs w:val="19"/>
+              </w:rPr>
+              <w:t xml:space="preserve">L'icona «espandi» in alto a destra della Home</w:t>
+            </w:r>
+          </w:p>
+        </w:tc>
+        <w:tc>
+          <w:tcPr>
+            <w:tcW w:type="dxa" w:w="4680"/>
+          </w:tcPr>
+          <w:p>
+            <w:r>
+              <w:rPr>
+                <w:sz w:val="19"/>
+                <w:szCs w:val="19"/>
+              </w:rPr>
+              <w:t xml:space="preserve">un glifo che non diceva dove portava. Adesso è il nome ad aprire il profilo</w:t>
+            </w:r>
+          </w:p>
+        </w:tc>
+      </w:tr>
+    </w:tbl>
+    <w:p>
+      <w:pPr>
+        <w:spacing w:after="120"/>
+      </w:pPr>
+    </w:p>
+    <w:p>
+      <w:pPr>
+        <w:spacing w:after="100"/>
+        <w:ind w:left="220"/>
+      </w:pPr>
+      <w:r>
+        <w:rPr>
+          <w:b/>
+          <w:bCs/>
+        </w:rPr>
+        <w:t xml:space="preserve">🔒  </w:t>
+      </w:r>
+      <w:r>
+        <w:t xml:space="preserve">In REGISTRA, quello che il sistema ha capito viene PRIMA del pulsante della foto: è la cosa che devi leggere, e stava sotto quella che usi di rado.</w:t>
+      </w:r>
+    </w:p>
+    <w:p>
+      <w:pPr>
+        <w:spacing w:after="100"/>
+        <w:ind w:left="220"/>
+      </w:pPr>
+      <w:r>
+        <w:rPr>
+          <w:b/>
+          <w:bCs/>
+        </w:rPr>
+        <w:t xml:space="preserve">🔒  </w:t>
+      </w:r>
+      <w:r>
+        <w:t xml:space="preserve">Le chip del profilo dichiarano di che asse sono — rarità, affinità, taglia — invece di essere tre parole in fila con lo stesso peso.</w:t>
+      </w:r>
+    </w:p>
+    <w:p>
+      <w:pPr>
+        <w:spacing w:after="100"/>
+        <w:ind w:left="220"/>
+      </w:pPr>
+      <w:r>
+        <w:rPr>
+          <w:b/>
+          <w:bCs/>
+        </w:rPr>
+        <w:t xml:space="preserve">🔒  </w:t>
+      </w:r>
+      <w:r>
+        <w:t xml:space="preserve">Un annuncio di sistema non può occupare il centro della schermata in modo permanente. Se non si può congedare, deve stare dove stava l'informazione periferica che sostituisce.</w:t>
       </w:r>
     </w:p>
     <w:p>
@@ -4556,6 +5183,66 @@
                 <w:szCs w:val="19"/>
               </w:rPr>
               <w:t xml:space="preserve">una chat con qualcuno che risponde (§7.2)</w:t>
+            </w:r>
+          </w:p>
+        </w:tc>
+      </w:tr>
+      <w:tr>
+        <w:tc>
+          <w:tcPr>
+            <w:tcW w:type="dxa" w:w="4680"/>
+          </w:tcPr>
+          <w:p>
+            <w:r>
+              <w:rPr>
+                <w:sz w:val="19"/>
+                <w:szCs w:val="19"/>
+              </w:rPr>
+              <w:t xml:space="preserve">Barra a segmenti dell'incubazione</w:t>
+            </w:r>
+          </w:p>
+        </w:tc>
+        <w:tc>
+          <w:tcPr>
+            <w:tcW w:type="dxa" w:w="4680"/>
+          </w:tcPr>
+          <w:p>
+            <w:r>
+              <w:rPr>
+                <w:sz w:val="19"/>
+                <w:szCs w:val="19"/>
+              </w:rPr>
+              <w:t xml:space="preserve">il guscio che si incrina (§7.3)</w:t>
+            </w:r>
+          </w:p>
+        </w:tc>
+      </w:tr>
+      <w:tr>
+        <w:tc>
+          <w:tcPr>
+            <w:tcW w:type="dxa" w:w="4680"/>
+          </w:tcPr>
+          <w:p>
+            <w:r>
+              <w:rPr>
+                <w:sz w:val="19"/>
+                <w:szCs w:val="19"/>
+              </w:rPr>
+              <w:t xml:space="preserve">Banner MINDLINE SHIFT</w:t>
+            </w:r>
+          </w:p>
+        </w:tc>
+        <w:tc>
+          <w:tcPr>
+            <w:tcW w:type="dxa" w:w="4680"/>
+          </w:tcPr>
+          <w:p>
+            <w:r>
+              <w:rPr>
+                <w:sz w:val="19"/>
+                <w:szCs w:val="19"/>
+              </w:rPr>
+              <w:t xml:space="preserve">la linea di SYNC che si riempie (§13.5)</w:t>
             </w:r>
           </w:p>
         </w:tc>

</xml_diff>